<commit_message>
test(harness): re-capture + bless top-level A3/insert (new ¶, was stale inline)
The A3/insert golden froze the pre-build-.2 inline "The quick brown fox XXX", but
the current @end→new-¶ rule makes it "The quick brown fox"¶"XXX" (as Ac3/insert
intra-cell already showed). Re-captured on build .3 with fresh evidence
(before/after screenshots + after.docx forcesave, save-fidelity verified),
selection block1:0→5 (the new XXX ¶). Verdict pass (Ben). cases.csv A3 note +
SELECTION-CASES regenerated; backlog item resolved. Oracle 32/32.
</commit_message>
<xml_diff>
--- a/test-harness/corpus/A3/insert/after.docx
+++ b/test-harness/corpus/A3/insert/after.docx
@@ -4,6 +4,7 @@
   <w:body>
     <w:p>
       <w:pPr>
+        <w:pStyle w:val="138"/>
         <w:pBdr/>
         <w:spacing/>
         <w:ind/>
@@ -13,13 +14,16 @@
         <w:t xml:space="preserve">The quick brown fox</w:t>
       </w:r>
       <w:r/>
-      <w:r>
-        <w:rPr>
-          <w:rFonts w:hint="default" w:ascii="Times New Roman" w:hAnsi="Times New Roman" w:eastAsia="Times New Roman" w:cs="Times New Roman"/>
-          <w:sz w:val="20"/>
-        </w:rPr>
-        <w:t xml:space="preserve"> </w:t>
-      </w:r>
+      <w:r/>
+      <w:r/>
+    </w:p>
+    <w:p>
+      <w:pPr>
+        <w:pBdr/>
+        <w:spacing/>
+        <w:ind/>
+        <w:rPr/>
+      </w:pPr>
       <w:r>
         <w:rPr>
           <w:rFonts w:hint="default" w:ascii="Times New Roman" w:hAnsi="Times New Roman" w:eastAsia="Times New Roman" w:cs="Times New Roman"/>
@@ -27,8 +31,6 @@
         </w:rPr>
         <w:t xml:space="preserve">XXX</w:t>
       </w:r>
-      <w:r/>
-      <w:r/>
       <w:r/>
     </w:p>
     <w:p>

</xml_diff>